<commit_message>
DM-T2 MAXIMUS: use each satellite's actual hashdiff column
67 MAXIMUS satellites write a suffixed hashdiff (HASHDIFF_<SATELLITE>, from the
model's src_hashdiff), so count_if(HASHDIFF is null) errored with an invalid
identifier. Each affected section now checks its own column, taken from the dbt
model. All 98 satellite sections verified against their models in sql + docx.
</commit_message>
<xml_diff>
--- a/BGIL_DBT/validation/DM-T/DM-T2_MAXIMUS.docx
+++ b/BGIL_DBT/validation/DM-T/DM-T2_MAXIMUS.docx
@@ -14403,7 +14403,7 @@
                 <w:rFonts w:ascii="Consolas" w:hAnsi="Consolas"/>
                 <w:sz w:val="17"/>
               </w:rPr>
-              <w:t xml:space="preserve">       count_if(HASHDIFF is null) as null_hashdiff,</w:t>
+              <w:t xml:space="preserve">       count_if(HASHDIFF_AUG_COMMON_ADDRESS is null) as null_hashdiff,</w:t>
             </w:r>
             <w:r>
               <w:rPr>
@@ -14793,7 +14793,7 @@
                 <w:rFonts w:ascii="Consolas" w:hAnsi="Consolas"/>
                 <w:sz w:val="17"/>
               </w:rPr>
-              <w:t xml:space="preserve">       count_if(HASHDIFF is null) as null_hashdiff,</w:t>
+              <w:t xml:space="preserve">       count_if(HASHDIFF_AUG_COMMON_ADMIN_GEOGRAPHY is null) as null_hashdiff,</w:t>
             </w:r>
             <w:r>
               <w:rPr>
@@ -15183,7 +15183,7 @@
                 <w:rFonts w:ascii="Consolas" w:hAnsi="Consolas"/>
                 <w:sz w:val="17"/>
               </w:rPr>
-              <w:t xml:space="preserve">       count_if(HASHDIFF is null) as null_hashdiff,</w:t>
+              <w:t xml:space="preserve">       count_if(HASHDIFF_AUG_COMMON_CLASSIFICATION is null) as null_hashdiff,</w:t>
             </w:r>
             <w:r>
               <w:rPr>
@@ -15573,7 +15573,7 @@
                 <w:rFonts w:ascii="Consolas" w:hAnsi="Consolas"/>
                 <w:sz w:val="17"/>
               </w:rPr>
-              <w:t xml:space="preserve">       count_if(HASHDIFF is null) as null_hashdiff,</w:t>
+              <w:t xml:space="preserve">       count_if(HASHDIFF_AUG_COMMON_COMMUNICATION_PREFERENCE is null) as null_hashdiff,</w:t>
             </w:r>
             <w:r>
               <w:rPr>
@@ -15963,7 +15963,7 @@
                 <w:rFonts w:ascii="Consolas" w:hAnsi="Consolas"/>
                 <w:sz w:val="17"/>
               </w:rPr>
-              <w:t xml:space="preserve">       count_if(HASHDIFF is null) as null_hashdiff,</w:t>
+              <w:t xml:space="preserve">       count_if(HASHDIFF_AUG_COMMON_CONTACT is null) as null_hashdiff,</w:t>
             </w:r>
             <w:r>
               <w:rPr>
@@ -16353,7 +16353,7 @@
                 <w:rFonts w:ascii="Consolas" w:hAnsi="Consolas"/>
                 <w:sz w:val="17"/>
               </w:rPr>
-              <w:t xml:space="preserve">       count_if(HASHDIFF is null) as null_hashdiff,</w:t>
+              <w:t xml:space="preserve">       count_if(HASHDIFF_AUG_COMMON_GEO is null) as null_hashdiff,</w:t>
             </w:r>
             <w:r>
               <w:rPr>
@@ -16743,7 +16743,7 @@
                 <w:rFonts w:ascii="Consolas" w:hAnsi="Consolas"/>
                 <w:sz w:val="17"/>
               </w:rPr>
-              <w:t xml:space="preserve">       count_if(HASHDIFF is null) as null_hashdiff,</w:t>
+              <w:t xml:space="preserve">       count_if(HASHDIFF_AUG_INSTRUMENT_DEFINITION is null) as null_hashdiff,</w:t>
             </w:r>
             <w:r>
               <w:rPr>
@@ -17133,7 +17133,7 @@
                 <w:rFonts w:ascii="Consolas" w:hAnsi="Consolas"/>
                 <w:sz w:val="17"/>
               </w:rPr>
-              <w:t xml:space="preserve">       count_if(HASHDIFF is null) as null_hashdiff,</w:t>
+              <w:t xml:space="preserve">       count_if(HASHDIFF_AUG_LNK_PARTY_ROLE_CORE is null) as null_hashdiff,</w:t>
             </w:r>
             <w:r>
               <w:rPr>
@@ -18355,7 +18355,7 @@
                 <w:rFonts w:ascii="Consolas" w:hAnsi="Consolas"/>
                 <w:sz w:val="17"/>
               </w:rPr>
-              <w:t xml:space="preserve">       count_if(HASHDIFF is null) as null_hashdiff,</w:t>
+              <w:t xml:space="preserve">       count_if(HASHDIFF_AUG_LNK_ROLE_NOMINEE_BENEFICIARY is null) as null_hashdiff,</w:t>
             </w:r>
             <w:r>
               <w:rPr>
@@ -19617,7 +19617,7 @@
                 <w:rFonts w:ascii="Consolas" w:hAnsi="Consolas"/>
                 <w:sz w:val="17"/>
               </w:rPr>
-              <w:t xml:space="preserve">       count_if(HASHDIFF is null) as null_hashdiff,</w:t>
+              <w:t xml:space="preserve">       count_if(HASHDIFF_AUG_PARTY_AGENT_PRODUCTION is null) as null_hashdiff,</w:t>
             </w:r>
             <w:r>
               <w:rPr>
@@ -19995,7 +19995,7 @@
                 <w:rFonts w:ascii="Consolas" w:hAnsi="Consolas"/>
                 <w:sz w:val="17"/>
               </w:rPr>
-              <w:t xml:space="preserve">       count_if(HASHDIFF is null) as null_hashdiff,</w:t>
+              <w:t xml:space="preserve">       count_if(HASHDIFF_AUG_PARTY_AMENDMENT_ENDORSEMENT is null) as null_hashdiff,</w:t>
             </w:r>
             <w:r>
               <w:rPr>
@@ -20385,7 +20385,7 @@
                 <w:rFonts w:ascii="Consolas" w:hAnsi="Consolas"/>
                 <w:sz w:val="17"/>
               </w:rPr>
-              <w:t xml:space="preserve">       count_if(HASHDIFF is null) as null_hashdiff,</w:t>
+              <w:t xml:space="preserve">       count_if(HASHDIFF_AUG_PARTY_BANKING is null) as null_hashdiff,</w:t>
             </w:r>
             <w:r>
               <w:rPr>
@@ -20763,7 +20763,7 @@
                 <w:rFonts w:ascii="Consolas" w:hAnsi="Consolas"/>
                 <w:sz w:val="17"/>
               </w:rPr>
-              <w:t xml:space="preserve">       count_if(HASHDIFF is null) as null_hashdiff,</w:t>
+              <w:t xml:space="preserve">       count_if(HASHDIFF_AUG_PARTY_CLAIM_HISTORY is null) as null_hashdiff,</w:t>
             </w:r>
             <w:r>
               <w:rPr>
@@ -21153,7 +21153,7 @@
                 <w:rFonts w:ascii="Consolas" w:hAnsi="Consolas"/>
                 <w:sz w:val="17"/>
               </w:rPr>
-              <w:t xml:space="preserve">       count_if(HASHDIFF is null) as null_hashdiff,</w:t>
+              <w:t xml:space="preserve">       count_if(HASHDIFF_AUG_PARTY_CONTACT_ADDRESS_LINK is null) as null_hashdiff,</w:t>
             </w:r>
             <w:r>
               <w:rPr>
@@ -21531,7 +21531,7 @@
                 <w:rFonts w:ascii="Consolas" w:hAnsi="Consolas"/>
                 <w:sz w:val="17"/>
               </w:rPr>
-              <w:t xml:space="preserve">       count_if(HASHDIFF is null) as null_hashdiff,</w:t>
+              <w:t xml:space="preserve">       count_if(HASHDIFF_AUG_PARTY_CORRESPONDENCE is null) as null_hashdiff,</w:t>
             </w:r>
             <w:r>
               <w:rPr>
@@ -21909,7 +21909,7 @@
                 <w:rFonts w:ascii="Consolas" w:hAnsi="Consolas"/>
                 <w:sz w:val="17"/>
               </w:rPr>
-              <w:t xml:space="preserve">       count_if(HASHDIFF is null) as null_hashdiff,</w:t>
+              <w:t xml:space="preserve">       count_if(HASHDIFF_AUG_PARTY_CREDIT_CONTROL_PAYMENT_TERMS is null) as null_hashdiff,</w:t>
             </w:r>
             <w:r>
               <w:rPr>
@@ -22299,7 +22299,7 @@
                 <w:rFonts w:ascii="Consolas" w:hAnsi="Consolas"/>
                 <w:sz w:val="17"/>
               </w:rPr>
-              <w:t xml:space="preserve">       count_if(HASHDIFF is null) as null_hashdiff,</w:t>
+              <w:t xml:space="preserve">       count_if(HASHDIFF_AUG_PARTY_DIGITAL_IDENTITY is null) as null_hashdiff,</w:t>
             </w:r>
             <w:r>
               <w:rPr>
@@ -22677,7 +22677,7 @@
                 <w:rFonts w:ascii="Consolas" w:hAnsi="Consolas"/>
                 <w:sz w:val="17"/>
               </w:rPr>
-              <w:t xml:space="preserve">       count_if(HASHDIFF is null) as null_hashdiff,</w:t>
+              <w:t xml:space="preserve">       count_if(HASHDIFF_AUG_PARTY_DRIVING is null) as null_hashdiff,</w:t>
             </w:r>
             <w:r>
               <w:rPr>
@@ -23067,7 +23067,7 @@
                 <w:rFonts w:ascii="Consolas" w:hAnsi="Consolas"/>
                 <w:sz w:val="17"/>
               </w:rPr>
-              <w:t xml:space="preserve">       count_if(HASHDIFF is null) as null_hashdiff,</w:t>
+              <w:t xml:space="preserve">       count_if(HASHDIFF_AUG_PARTY_EMPLOYMENT is null) as null_hashdiff,</w:t>
             </w:r>
             <w:r>
               <w:rPr>
@@ -23457,7 +23457,7 @@
                 <w:rFonts w:ascii="Consolas" w:hAnsi="Consolas"/>
                 <w:sz w:val="17"/>
               </w:rPr>
-              <w:t xml:space="preserve">       count_if(HASHDIFF is null) as null_hashdiff,</w:t>
+              <w:t xml:space="preserve">       count_if(HASHDIFF_AUG_PARTY_FINANCIAL_PROFILE is null) as null_hashdiff,</w:t>
             </w:r>
             <w:r>
               <w:rPr>
@@ -23847,7 +23847,7 @@
                 <w:rFonts w:ascii="Consolas" w:hAnsi="Consolas"/>
                 <w:sz w:val="17"/>
               </w:rPr>
-              <w:t xml:space="preserve">       count_if(HASHDIFF is null) as null_hashdiff,</w:t>
+              <w:t xml:space="preserve">       count_if(HASHDIFF_AUG_PARTY_FRAUD_PROFILE is null) as null_hashdiff,</w:t>
             </w:r>
             <w:r>
               <w:rPr>
@@ -24225,7 +24225,7 @@
                 <w:rFonts w:ascii="Consolas" w:hAnsi="Consolas"/>
                 <w:sz w:val="17"/>
               </w:rPr>
-              <w:t xml:space="preserve">       count_if(HASHDIFF is null) as null_hashdiff,</w:t>
+              <w:t xml:space="preserve">       count_if(HASHDIFF_AUG_PARTY_GROUP_SCHEME is null) as null_hashdiff,</w:t>
             </w:r>
             <w:r>
               <w:rPr>
@@ -24615,7 +24615,7 @@
                 <w:rFonts w:ascii="Consolas" w:hAnsi="Consolas"/>
                 <w:sz w:val="17"/>
               </w:rPr>
-              <w:t xml:space="preserve">       count_if(HASHDIFF is null) as null_hashdiff,</w:t>
+              <w:t xml:space="preserve">       count_if(HASHDIFF_AUG_PARTY_HEALTH_PROFILE is null) as null_hashdiff,</w:t>
             </w:r>
             <w:r>
               <w:rPr>
@@ -25005,7 +25005,7 @@
                 <w:rFonts w:ascii="Consolas" w:hAnsi="Consolas"/>
                 <w:sz w:val="17"/>
               </w:rPr>
-              <w:t xml:space="preserve">       count_if(HASHDIFF is null) as null_hashdiff,</w:t>
+              <w:t xml:space="preserve">       count_if(HASHDIFF_AUG_PARTY_HIERARCHY is null) as null_hashdiff,</w:t>
             </w:r>
             <w:r>
               <w:rPr>
@@ -25395,7 +25395,7 @@
                 <w:rFonts w:ascii="Consolas" w:hAnsi="Consolas"/>
                 <w:sz w:val="17"/>
               </w:rPr>
-              <w:t xml:space="preserve">       count_if(HASHDIFF is null) as null_hashdiff,</w:t>
+              <w:t xml:space="preserve">       count_if(HASHDIFF_AUG_PARTY_IDENTIFICATION is null) as null_hashdiff,</w:t>
             </w:r>
             <w:r>
               <w:rPr>
@@ -25785,7 +25785,7 @@
                 <w:rFonts w:ascii="Consolas" w:hAnsi="Consolas"/>
                 <w:sz w:val="17"/>
               </w:rPr>
-              <w:t xml:space="preserve">       count_if(HASHDIFF is null) as null_hashdiff,</w:t>
+              <w:t xml:space="preserve">       count_if(HASHDIFF_AUG_PARTY_IDENTITY is null) as null_hashdiff,</w:t>
             </w:r>
             <w:r>
               <w:rPr>
@@ -26175,7 +26175,7 @@
                 <w:rFonts w:ascii="Consolas" w:hAnsi="Consolas"/>
                 <w:sz w:val="17"/>
               </w:rPr>
-              <w:t xml:space="preserve">       count_if(HASHDIFF is null) as null_hashdiff,</w:t>
+              <w:t xml:space="preserve">       count_if(HASHDIFF_AUG_PARTY_INDIVIDUAL_DEMOGRAPHICS is null) as null_hashdiff,</w:t>
             </w:r>
             <w:r>
               <w:rPr>
@@ -26553,7 +26553,7 @@
                 <w:rFonts w:ascii="Consolas" w:hAnsi="Consolas"/>
                 <w:sz w:val="17"/>
               </w:rPr>
-              <w:t xml:space="preserve">       count_if(HASHDIFF is null) as null_hashdiff,</w:t>
+              <w:t xml:space="preserve">       count_if(HASHDIFF_AUG_PARTY_INTERACTION is null) as null_hashdiff,</w:t>
             </w:r>
             <w:r>
               <w:rPr>
@@ -26943,7 +26943,7 @@
                 <w:rFonts w:ascii="Consolas" w:hAnsi="Consolas"/>
                 <w:sz w:val="17"/>
               </w:rPr>
-              <w:t xml:space="preserve">       count_if(HASHDIFF is null) as null_hashdiff,</w:t>
+              <w:t xml:space="preserve">       count_if(HASHDIFF_AUG_PARTY_KYC is null) as null_hashdiff,</w:t>
             </w:r>
             <w:r>
               <w:rPr>
@@ -27333,7 +27333,7 @@
                 <w:rFonts w:ascii="Consolas" w:hAnsi="Consolas"/>
                 <w:sz w:val="17"/>
               </w:rPr>
-              <w:t xml:space="preserve">       count_if(HASHDIFF is null) as null_hashdiff,</w:t>
+              <w:t xml:space="preserve">       count_if(HASHDIFF_AUG_PARTY_LEGAL_PANEL is null) as null_hashdiff,</w:t>
             </w:r>
             <w:r>
               <w:rPr>
@@ -27711,7 +27711,7 @@
                 <w:rFonts w:ascii="Consolas" w:hAnsi="Consolas"/>
                 <w:sz w:val="17"/>
               </w:rPr>
-              <w:t xml:space="preserve">       count_if(HASHDIFF is null) as null_hashdiff,</w:t>
+              <w:t xml:space="preserve">       count_if(HASHDIFF_AUG_PARTY_LEGAL_PANEL_ROLE_LINE is null) as null_hashdiff,</w:t>
             </w:r>
             <w:r>
               <w:rPr>
@@ -28089,7 +28089,7 @@
                 <w:rFonts w:ascii="Consolas" w:hAnsi="Consolas"/>
                 <w:sz w:val="17"/>
               </w:rPr>
-              <w:t xml:space="preserve">       count_if(HASHDIFF is null) as null_hashdiff,</w:t>
+              <w:t xml:space="preserve">       count_if(HASHDIFF_AUG_PARTY_MARKETING is null) as null_hashdiff,</w:t>
             </w:r>
             <w:r>
               <w:rPr>
@@ -28479,7 +28479,7 @@
                 <w:rFonts w:ascii="Consolas" w:hAnsi="Consolas"/>
                 <w:sz w:val="17"/>
               </w:rPr>
-              <w:t xml:space="preserve">       count_if(HASHDIFF is null) as null_hashdiff,</w:t>
+              <w:t xml:space="preserve">       count_if(HASHDIFF_AUG_PARTY_ONBOARDING_JOURNEY is null) as null_hashdiff,</w:t>
             </w:r>
             <w:r>
               <w:rPr>
@@ -28869,7 +28869,7 @@
                 <w:rFonts w:ascii="Consolas" w:hAnsi="Consolas"/>
                 <w:sz w:val="17"/>
               </w:rPr>
-              <w:t xml:space="preserve">       count_if(HASHDIFF is null) as null_hashdiff,</w:t>
+              <w:t xml:space="preserve">       count_if(HASHDIFF_AUG_PARTY_ORGANISATION_PROFILE is null) as null_hashdiff,</w:t>
             </w:r>
             <w:r>
               <w:rPr>
@@ -29259,7 +29259,7 @@
                 <w:rFonts w:ascii="Consolas" w:hAnsi="Consolas"/>
                 <w:sz w:val="17"/>
               </w:rPr>
-              <w:t xml:space="preserve">       count_if(HASHDIFF is null) as null_hashdiff,</w:t>
+              <w:t xml:space="preserve">       count_if(HASHDIFF_AUG_PARTY_ORG_DIRECTORS is null) as null_hashdiff,</w:t>
             </w:r>
             <w:r>
               <w:rPr>
@@ -29649,7 +29649,7 @@
                 <w:rFonts w:ascii="Consolas" w:hAnsi="Consolas"/>
                 <w:sz w:val="17"/>
               </w:rPr>
-              <w:t xml:space="preserve">       count_if(HASHDIFF is null) as null_hashdiff,</w:t>
+              <w:t xml:space="preserve">       count_if(HASHDIFF_AUG_PARTY_PAYOUT_PROFILE is null) as null_hashdiff,</w:t>
             </w:r>
             <w:r>
               <w:rPr>
@@ -30027,7 +30027,7 @@
                 <w:rFonts w:ascii="Consolas" w:hAnsi="Consolas"/>
                 <w:sz w:val="17"/>
               </w:rPr>
-              <w:t xml:space="preserve">       count_if(HASHDIFF is null) as null_hashdiff,</w:t>
+              <w:t xml:space="preserve">       count_if(HASHDIFF_AUG_PARTY_PREFERENCE_PROFILE is null) as null_hashdiff,</w:t>
             </w:r>
             <w:r>
               <w:rPr>
@@ -30417,7 +30417,7 @@
                 <w:rFonts w:ascii="Consolas" w:hAnsi="Consolas"/>
                 <w:sz w:val="17"/>
               </w:rPr>
-              <w:t xml:space="preserve">       count_if(HASHDIFF is null) as null_hashdiff,</w:t>
+              <w:t xml:space="preserve">       count_if(HASHDIFF_AUG_PARTY_PROVIDER_CAPABILITY is null) as null_hashdiff,</w:t>
             </w:r>
             <w:r>
               <w:rPr>
@@ -30795,7 +30795,7 @@
                 <w:rFonts w:ascii="Consolas" w:hAnsi="Consolas"/>
                 <w:sz w:val="17"/>
               </w:rPr>
-              <w:t xml:space="preserve">       count_if(HASHDIFF is null) as null_hashdiff,</w:t>
+              <w:t xml:space="preserve">       count_if(HASHDIFF_AUG_PARTY_RECORD_REMARKS is null) as null_hashdiff,</w:t>
             </w:r>
             <w:r>
               <w:rPr>
@@ -31185,7 +31185,7 @@
                 <w:rFonts w:ascii="Consolas" w:hAnsi="Consolas"/>
                 <w:sz w:val="17"/>
               </w:rPr>
-              <w:t xml:space="preserve">       count_if(HASHDIFF is null) as null_hashdiff,</w:t>
+              <w:t xml:space="preserve">       count_if(HASHDIFF_AUG_PARTY_RELATIONSHIP_PROFILE is null) as null_hashdiff,</w:t>
             </w:r>
             <w:r>
               <w:rPr>
@@ -31563,7 +31563,7 @@
                 <w:rFonts w:ascii="Consolas" w:hAnsi="Consolas"/>
                 <w:sz w:val="17"/>
               </w:rPr>
-              <w:t xml:space="preserve">       count_if(HASHDIFF is null) as null_hashdiff,</w:t>
+              <w:t xml:space="preserve">       count_if(HASHDIFF_AUG_PARTY_SERVICE_ENGAGEMENT_TERMS is null) as null_hashdiff,</w:t>
             </w:r>
             <w:r>
               <w:rPr>
@@ -31941,7 +31941,7 @@
                 <w:rFonts w:ascii="Consolas" w:hAnsi="Consolas"/>
                 <w:sz w:val="17"/>
               </w:rPr>
-              <w:t xml:space="preserve">       count_if(HASHDIFF is null) as null_hashdiff,</w:t>
+              <w:t xml:space="preserve">       count_if(HASHDIFF_AUG_PARTY_SOURCE_PROPERTY_SET_RECORD_GOVERNANCE is null) as null_hashdiff,</w:t>
             </w:r>
             <w:r>
               <w:rPr>
@@ -32319,7 +32319,7 @@
                 <w:rFonts w:ascii="Consolas" w:hAnsi="Consolas"/>
                 <w:sz w:val="17"/>
               </w:rPr>
-              <w:t xml:space="preserve">       count_if(HASHDIFF is null) as null_hashdiff,</w:t>
+              <w:t xml:space="preserve">       count_if(HASHDIFF_AUG_PARTY_SUSPENSION_NEGATIVE_ACTION is null) as null_hashdiff,</w:t>
             </w:r>
             <w:r>
               <w:rPr>
@@ -32697,7 +32697,7 @@
                 <w:rFonts w:ascii="Consolas" w:hAnsi="Consolas"/>
                 <w:sz w:val="17"/>
               </w:rPr>
-              <w:t xml:space="preserve">       count_if(HASHDIFF is null) as null_hashdiff,</w:t>
+              <w:t xml:space="preserve">       count_if(HASHDIFF_AUG_PARTY_VEHICLE_OWNER is null) as null_hashdiff,</w:t>
             </w:r>
             <w:r>
               <w:rPr>
@@ -33087,7 +33087,7 @@
                 <w:rFonts w:ascii="Consolas" w:hAnsi="Consolas"/>
                 <w:sz w:val="17"/>
               </w:rPr>
-              <w:t xml:space="preserve">       count_if(HASHDIFF is null) as null_hashdiff,</w:t>
+              <w:t xml:space="preserve">       count_if(HASHDIFF_AUG_PROVIDER_BANKING is null) as null_hashdiff,</w:t>
             </w:r>
             <w:r>
               <w:rPr>
@@ -33477,7 +33477,7 @@
                 <w:rFonts w:ascii="Consolas" w:hAnsi="Consolas"/>
                 <w:sz w:val="17"/>
               </w:rPr>
-              <w:t xml:space="preserve">       count_if(HASHDIFF is null) as null_hashdiff,</w:t>
+              <w:t xml:space="preserve">       count_if(HASHDIFF_AUG_PROVIDER_QUALITY is null) as null_hashdiff,</w:t>
             </w:r>
             <w:r>
               <w:rPr>
@@ -33867,7 +33867,7 @@
                 <w:rFonts w:ascii="Consolas" w:hAnsi="Consolas"/>
                 <w:sz w:val="17"/>
               </w:rPr>
-              <w:t xml:space="preserve">       count_if(HASHDIFF is null) as null_hashdiff,</w:t>
+              <w:t xml:space="preserve">       count_if(HASHDIFF_AUG_PROVIDER_TARIFF is null) as null_hashdiff,</w:t>
             </w:r>
             <w:r>
               <w:rPr>
@@ -34257,7 +34257,7 @@
                 <w:rFonts w:ascii="Consolas" w:hAnsi="Consolas"/>
                 <w:sz w:val="17"/>
               </w:rPr>
-              <w:t xml:space="preserve">       count_if(HASHDIFF is null) as null_hashdiff,</w:t>
+              <w:t xml:space="preserve">       count_if(HASHDIFF_CHANNEL_DEFINITION is null) as null_hashdiff,</w:t>
             </w:r>
             <w:r>
               <w:rPr>
@@ -37767,7 +37767,7 @@
                 <w:rFonts w:ascii="Consolas" w:hAnsi="Consolas"/>
                 <w:sz w:val="17"/>
               </w:rPr>
-              <w:t xml:space="preserve">       count_if(HASHDIFF is null) as null_hashdiff,</w:t>
+              <w:t xml:space="preserve">       count_if(HASHDIFF_INSTRUMENT_DEFINITION is null) as null_hashdiff,</w:t>
             </w:r>
             <w:r>
               <w:rPr>
@@ -39327,7 +39327,7 @@
                 <w:rFonts w:ascii="Consolas" w:hAnsi="Consolas"/>
                 <w:sz w:val="17"/>
               </w:rPr>
-              <w:t xml:space="preserve">       count_if(HASHDIFF is null) as null_hashdiff,</w:t>
+              <w:t xml:space="preserve">       count_if(HASHDIFF_LNK_ROLE_EMPLOYEE is null) as null_hashdiff,</w:t>
             </w:r>
             <w:r>
               <w:rPr>
@@ -39717,7 +39717,7 @@
                 <w:rFonts w:ascii="Consolas" w:hAnsi="Consolas"/>
                 <w:sz w:val="17"/>
               </w:rPr>
-              <w:t xml:space="preserve">       count_if(HASHDIFF is null) as null_hashdiff,</w:t>
+              <w:t xml:space="preserve">       count_if(HASHDIFF_LNK_ROLE_INVESTIGATOR is null) as null_hashdiff,</w:t>
             </w:r>
             <w:r>
               <w:rPr>
@@ -41277,7 +41277,7 @@
                 <w:rFonts w:ascii="Consolas" w:hAnsi="Consolas"/>
                 <w:sz w:val="17"/>
               </w:rPr>
-              <w:t xml:space="preserve">       count_if(HASHDIFF is null) as null_hashdiff,</w:t>
+              <w:t xml:space="preserve">       count_if(HASHDIFF_LOCATION_PROFILE is null) as null_hashdiff,</w:t>
             </w:r>
             <w:r>
               <w:rPr>
@@ -41667,7 +41667,7 @@
                 <w:rFonts w:ascii="Consolas" w:hAnsi="Consolas"/>
                 <w:sz w:val="17"/>
               </w:rPr>
-              <w:t xml:space="preserve">       count_if(HASHDIFF is null) as null_hashdiff,</w:t>
+              <w:t xml:space="preserve">       count_if(HASHDIFF_ORG_UNIT_DEFINITION is null) as null_hashdiff,</w:t>
             </w:r>
             <w:r>
               <w:rPr>
@@ -42057,7 +42057,7 @@
                 <w:rFonts w:ascii="Consolas" w:hAnsi="Consolas"/>
                 <w:sz w:val="17"/>
               </w:rPr>
-              <w:t xml:space="preserve">       count_if(HASHDIFF is null) as null_hashdiff,</w:t>
+              <w:t xml:space="preserve">       count_if(HASHDIFF_ORG_UNIT_LICENCE is null) as null_hashdiff,</w:t>
             </w:r>
             <w:r>
               <w:rPr>
@@ -42447,7 +42447,7 @@
                 <w:rFonts w:ascii="Consolas" w:hAnsi="Consolas"/>
                 <w:sz w:val="17"/>
               </w:rPr>
-              <w:t xml:space="preserve">       count_if(HASHDIFF is null) as null_hashdiff,</w:t>
+              <w:t xml:space="preserve">       count_if(HASHDIFF_PARTY_AGENT_LICENCE_LINE is null) as null_hashdiff,</w:t>
             </w:r>
             <w:r>
               <w:rPr>
@@ -43617,7 +43617,7 @@
                 <w:rFonts w:ascii="Consolas" w:hAnsi="Consolas"/>
                 <w:sz w:val="17"/>
               </w:rPr>
-              <w:t xml:space="preserve">       count_if(HASHDIFF is null) as null_hashdiff,</w:t>
+              <w:t xml:space="preserve">       count_if(HASHDIFF_PARTY_CONSENT_MANDATE is null) as null_hashdiff,</w:t>
             </w:r>
             <w:r>
               <w:rPr>
@@ -44397,7 +44397,7 @@
                 <w:rFonts w:ascii="Consolas" w:hAnsi="Consolas"/>
                 <w:sz w:val="17"/>
               </w:rPr>
-              <w:t xml:space="preserve">       count_if(HASHDIFF is null) as null_hashdiff,</w:t>
+              <w:t xml:space="preserve">       count_if(HASHDIFF_PARTY_DIGITAL_IDENTITY is null) as null_hashdiff,</w:t>
             </w:r>
             <w:r>
               <w:rPr>
@@ -45177,7 +45177,7 @@
                 <w:rFonts w:ascii="Consolas" w:hAnsi="Consolas"/>
                 <w:sz w:val="17"/>
               </w:rPr>
-              <w:t xml:space="preserve">       count_if(HASHDIFF is null) as null_hashdiff,</w:t>
+              <w:t xml:space="preserve">       count_if(HASHDIFF_PARTY_FINANCIAL_PROFILE is null) as null_hashdiff,</w:t>
             </w:r>
             <w:r>
               <w:rPr>
@@ -45567,7 +45567,7 @@
                 <w:rFonts w:ascii="Consolas" w:hAnsi="Consolas"/>
                 <w:sz w:val="17"/>
               </w:rPr>
-              <w:t xml:space="preserve">       count_if(HASHDIFF is null) as null_hashdiff,</w:t>
+              <w:t xml:space="preserve">       count_if(HASHDIFF_PARTY_FRAUD_PROFILE is null) as null_hashdiff,</w:t>
             </w:r>
             <w:r>
               <w:rPr>
@@ -46347,7 +46347,7 @@
                 <w:rFonts w:ascii="Consolas" w:hAnsi="Consolas"/>
                 <w:sz w:val="17"/>
               </w:rPr>
-              <w:t xml:space="preserve">       count_if(HASHDIFF is null) as null_hashdiff,</w:t>
+              <w:t xml:space="preserve">       count_if(HASHDIFF_PARTY_HIERARCHY is null) as null_hashdiff,</w:t>
             </w:r>
             <w:r>
               <w:rPr>
@@ -48297,7 +48297,7 @@
                 <w:rFonts w:ascii="Consolas" w:hAnsi="Consolas"/>
                 <w:sz w:val="17"/>
               </w:rPr>
-              <w:t xml:space="preserve">       count_if(HASHDIFF is null) as null_hashdiff,</w:t>
+              <w:t xml:space="preserve">       count_if(HASHDIFF_PARTY_LEGAL_PANEL is null) as null_hashdiff,</w:t>
             </w:r>
             <w:r>
               <w:rPr>
@@ -48687,7 +48687,7 @@
                 <w:rFonts w:ascii="Consolas" w:hAnsi="Consolas"/>
                 <w:sz w:val="17"/>
               </w:rPr>
-              <w:t xml:space="preserve">       count_if(HASHDIFF is null) as null_hashdiff,</w:t>
+              <w:t xml:space="preserve">       count_if(HASHDIFF_PARTY_ONBOARDING_JOURNEY is null) as null_hashdiff,</w:t>
             </w:r>
             <w:r>
               <w:rPr>
@@ -49467,7 +49467,7 @@
                 <w:rFonts w:ascii="Consolas" w:hAnsi="Consolas"/>
                 <w:sz w:val="17"/>
               </w:rPr>
-              <w:t xml:space="preserve">       count_if(HASHDIFF is null) as null_hashdiff,</w:t>
+              <w:t xml:space="preserve">       count_if(HASHDIFF_PARTY_ORG_DIRECTORS is null) as null_hashdiff,</w:t>
             </w:r>
             <w:r>
               <w:rPr>
@@ -49857,7 +49857,7 @@
                 <w:rFonts w:ascii="Consolas" w:hAnsi="Consolas"/>
                 <w:sz w:val="17"/>
               </w:rPr>
-              <w:t xml:space="preserve">       count_if(HASHDIFF is null) as null_hashdiff,</w:t>
+              <w:t xml:space="preserve">       count_if(HASHDIFF_PARTY_PAYOUT_PROFILE is null) as null_hashdiff,</w:t>
             </w:r>
             <w:r>
               <w:rPr>
@@ -50247,7 +50247,7 @@
                 <w:rFonts w:ascii="Consolas" w:hAnsi="Consolas"/>
                 <w:sz w:val="17"/>
               </w:rPr>
-              <w:t xml:space="preserve">       count_if(HASHDIFF is null) as null_hashdiff,</w:t>
+              <w:t xml:space="preserve">       count_if(HASHDIFF_PARTY_PROVIDER_CAPABILITY is null) as null_hashdiff,</w:t>
             </w:r>
             <w:r>
               <w:rPr>
@@ -50637,7 +50637,7 @@
                 <w:rFonts w:ascii="Consolas" w:hAnsi="Consolas"/>
                 <w:sz w:val="17"/>
               </w:rPr>
-              <w:t xml:space="preserve">       count_if(HASHDIFF is null) as null_hashdiff,</w:t>
+              <w:t xml:space="preserve">       count_if(HASHDIFF_PARTY_RELATIONSHIP_PROFILE is null) as null_hashdiff,</w:t>
             </w:r>
             <w:r>
               <w:rPr>
@@ -51807,7 +51807,7 @@
                 <w:rFonts w:ascii="Consolas" w:hAnsi="Consolas"/>
                 <w:sz w:val="17"/>
               </w:rPr>
-              <w:t xml:space="preserve">       count_if(HASHDIFF is null) as null_hashdiff,</w:t>
+              <w:t xml:space="preserve">       count_if(HASHDIFF_PROVIDER_QUALITY is null) as null_hashdiff,</w:t>
             </w:r>
             <w:r>
               <w:rPr>

</xml_diff>

<commit_message>
DM-T2 MAXIMUS docx: fill Result + Remarks for source-fail sections
Set Result='Fail(Due to source issue)' and a Remarks line naming the null
source table for the 31 remaining Partner LOB fail sections (19,22,25,32,35,
37-39,41,42,47,48,51-53,56,58,63-65,85,86,92,94,95,102,103,105,107,108,111).
All null at stg_maximus__pd_prop_sp_pv (92 also pd_prop_msdp_pv). Earlier
sections 4-18 and attachments unchanged.
</commit_message>
<xml_diff>
--- a/BGIL_DBT/validation/DM-T/DM-T2_MAXIMUS.docx
+++ b/BGIL_DBT/validation/DM-T/DM-T2_MAXIMUS.docx
@@ -16077,11 +16077,7 @@
           </w:tcPr>
           <w:p>
             <w:r>
-              <w:rPr>
-                <w:lang w:val="en-US"/>
-                <w:rtl w:val="off"/>
-              </w:rPr>
-              <w:t>Fail</w:t>
+              <w:t xml:space="preserve">Fail(Due to source issue)</w:t>
             </w:r>
           </w:p>
         </w:tc>
@@ -16125,7 +16121,11 @@
           <w:tcPr>
             <w:tcW w:w="5640" w:type="dxa"/>
           </w:tcPr>
-          <w:p/>
+          <w:p>
+            <w:r>
+              <w:t xml:space="preserve">Null at source table stg_maximus__pd_prop_sp_pv for its columns</w:t>
+            </w:r>
+          </w:p>
         </w:tc>
       </w:tr>
     </w:tbl>
@@ -17359,11 +17359,7 @@
           </w:tcPr>
           <w:p>
             <w:r>
-              <w:rPr>
-                <w:lang w:val="en-US"/>
-                <w:rtl w:val="off"/>
-              </w:rPr>
-              <w:t>Fail</w:t>
+              <w:t xml:space="preserve">Fail(Due to source issue)</w:t>
             </w:r>
           </w:p>
         </w:tc>
@@ -17407,7 +17403,11 @@
           <w:tcPr>
             <w:tcW w:w="5640" w:type="dxa"/>
           </w:tcPr>
-          <w:p/>
+          <w:p>
+            <w:r>
+              <w:t xml:space="preserve">Null at source table stg_maximus__pd_prop_sp_pv for its columns</w:t>
+            </w:r>
+          </w:p>
         </w:tc>
       </w:tr>
     </w:tbl>
@@ -18597,11 +18597,7 @@
           </w:tcPr>
           <w:p>
             <w:r>
-              <w:rPr>
-                <w:lang w:val="en-US"/>
-                <w:rtl w:val="off"/>
-              </w:rPr>
-              <w:t>Fail</w:t>
+              <w:t xml:space="preserve">Fail(Due to source issue)</w:t>
             </w:r>
           </w:p>
         </w:tc>
@@ -18645,7 +18641,11 @@
           <w:tcPr>
             <w:tcW w:w="5640" w:type="dxa"/>
           </w:tcPr>
-          <w:p/>
+          <w:p>
+            <w:r>
+              <w:t xml:space="preserve">Null at source table stg_maximus__pd_prop_sp_pv for its columns</w:t>
+            </w:r>
+          </w:p>
         </w:tc>
       </w:tr>
     </w:tbl>
@@ -21455,11 +21455,7 @@
           </w:tcPr>
           <w:p>
             <w:r>
-              <w:rPr>
-                <w:lang w:val="en-US"/>
-                <w:rtl w:val="off"/>
-              </w:rPr>
-              <w:t>Fail</w:t>
+              <w:t xml:space="preserve">Fail(Due to source issue)</w:t>
             </w:r>
           </w:p>
         </w:tc>
@@ -21503,7 +21499,11 @@
           <w:tcPr>
             <w:tcW w:w="5640" w:type="dxa"/>
           </w:tcPr>
-          <w:p/>
+          <w:p>
+            <w:r>
+              <w:t xml:space="preserve">Null at source table stg_maximus__pd_prop_sp_pv for its columns</w:t>
+            </w:r>
+          </w:p>
         </w:tc>
       </w:tr>
     </w:tbl>
@@ -22609,11 +22609,7 @@
           </w:tcPr>
           <w:p>
             <w:r>
-              <w:rPr>
-                <w:lang w:val="en-US"/>
-                <w:rtl w:val="off"/>
-              </w:rPr>
-              <w:t>Fail</w:t>
+              <w:t xml:space="preserve">Fail(Due to source issue)</w:t>
             </w:r>
           </w:p>
         </w:tc>
@@ -22657,7 +22653,11 @@
           <w:tcPr>
             <w:tcW w:w="5640" w:type="dxa"/>
           </w:tcPr>
-          <w:p/>
+          <w:p>
+            <w:r>
+              <w:t xml:space="preserve">Null at source table stg_maximus__pd_prop_sp_pv for its columns</w:t>
+            </w:r>
+          </w:p>
         </w:tc>
       </w:tr>
     </w:tbl>
@@ -23385,11 +23385,7 @@
           </w:tcPr>
           <w:p>
             <w:r>
-              <w:rPr>
-                <w:lang w:val="en-US"/>
-                <w:rtl w:val="off"/>
-              </w:rPr>
-              <w:t>Fail</w:t>
+              <w:t xml:space="preserve">Fail(Due to source issue)</w:t>
             </w:r>
           </w:p>
         </w:tc>
@@ -23433,7 +23429,11 @@
           <w:tcPr>
             <w:tcW w:w="5640" w:type="dxa"/>
           </w:tcPr>
-          <w:p/>
+          <w:p>
+            <w:r>
+              <w:t xml:space="preserve">Null at source table stg_maximus__pd_prop_sp_pv for its columns</w:t>
+            </w:r>
+          </w:p>
         </w:tc>
       </w:tr>
     </w:tbl>
@@ -23783,11 +23783,7 @@
           </w:tcPr>
           <w:p>
             <w:r>
-              <w:rPr>
-                <w:lang w:val="en-US"/>
-                <w:rtl w:val="off"/>
-              </w:rPr>
-              <w:t>Fail</w:t>
+              <w:t xml:space="preserve">Fail(Due to source issue)</w:t>
             </w:r>
           </w:p>
         </w:tc>
@@ -23831,7 +23827,11 @@
           <w:tcPr>
             <w:tcW w:w="5640" w:type="dxa"/>
           </w:tcPr>
-          <w:p/>
+          <w:p>
+            <w:r>
+              <w:t xml:space="preserve">Null at source table stg_maximus__pd_prop_sp_pv for its columns</w:t>
+            </w:r>
+          </w:p>
         </w:tc>
       </w:tr>
     </w:tbl>
@@ -24181,11 +24181,7 @@
           </w:tcPr>
           <w:p>
             <w:r>
-              <w:rPr>
-                <w:lang w:val="en-US"/>
-                <w:rtl w:val="off"/>
-              </w:rPr>
-              <w:t>Fail</w:t>
+              <w:t xml:space="preserve">Fail(Due to source issue)</w:t>
             </w:r>
           </w:p>
         </w:tc>
@@ -24229,7 +24225,11 @@
           <w:tcPr>
             <w:tcW w:w="5640" w:type="dxa"/>
           </w:tcPr>
-          <w:p/>
+          <w:p>
+            <w:r>
+              <w:t xml:space="preserve">Null at source table stg_maximus__pd_prop_sp_pv for its columns</w:t>
+            </w:r>
+          </w:p>
         </w:tc>
       </w:tr>
     </w:tbl>
@@ -24957,11 +24957,7 @@
           </w:tcPr>
           <w:p>
             <w:r>
-              <w:rPr>
-                <w:lang w:val="en-US"/>
-                <w:rtl w:val="off"/>
-              </w:rPr>
-              <w:t>Fail</w:t>
+              <w:t xml:space="preserve">Fail(Due to source issue)</w:t>
             </w:r>
           </w:p>
         </w:tc>
@@ -25005,7 +25001,11 @@
           <w:tcPr>
             <w:tcW w:w="5640" w:type="dxa"/>
           </w:tcPr>
-          <w:p/>
+          <w:p>
+            <w:r>
+              <w:t xml:space="preserve">Null at source table stg_maximus__pd_prop_sp_pv for its columns</w:t>
+            </w:r>
+          </w:p>
         </w:tc>
       </w:tr>
     </w:tbl>
@@ -25355,11 +25355,7 @@
           </w:tcPr>
           <w:p>
             <w:r>
-              <w:rPr>
-                <w:lang w:val="en-US"/>
-                <w:rtl w:val="off"/>
-              </w:rPr>
-              <w:t>Fail</w:t>
+              <w:t xml:space="preserve">Fail(Due to source issue)</w:t>
             </w:r>
           </w:p>
         </w:tc>
@@ -25403,7 +25399,11 @@
           <w:tcPr>
             <w:tcW w:w="5640" w:type="dxa"/>
           </w:tcPr>
-          <w:p/>
+          <w:p>
+            <w:r>
+              <w:t xml:space="preserve">Null at source table stg_maximus__pd_prop_sp_pv for its columns</w:t>
+            </w:r>
+          </w:p>
         </w:tc>
       </w:tr>
     </w:tbl>
@@ -27457,11 +27457,7 @@
           </w:tcPr>
           <w:p>
             <w:r>
-              <w:rPr>
-                <w:lang w:val="en-US"/>
-                <w:rtl w:val="off"/>
-              </w:rPr>
-              <w:t>Fail</w:t>
+              <w:t xml:space="preserve">Fail(Due to source issue)</w:t>
             </w:r>
           </w:p>
         </w:tc>
@@ -27505,7 +27501,11 @@
           <w:tcPr>
             <w:tcW w:w="5640" w:type="dxa"/>
           </w:tcPr>
-          <w:p/>
+          <w:p>
+            <w:r>
+              <w:t xml:space="preserve">Null at source table stg_maximus__pd_prop_sp_pv for its columns</w:t>
+            </w:r>
+          </w:p>
         </w:tc>
       </w:tr>
     </w:tbl>
@@ -27855,11 +27855,7 @@
           </w:tcPr>
           <w:p>
             <w:r>
-              <w:rPr>
-                <w:lang w:val="en-US"/>
-                <w:rtl w:val="off"/>
-              </w:rPr>
-              <w:t>Fail</w:t>
+              <w:t xml:space="preserve">Fail(Due to source issue)</w:t>
             </w:r>
           </w:p>
         </w:tc>
@@ -27903,7 +27899,11 @@
           <w:tcPr>
             <w:tcW w:w="5640" w:type="dxa"/>
           </w:tcPr>
-          <w:p/>
+          <w:p>
+            <w:r>
+              <w:t xml:space="preserve">Null at source table stg_maximus__pd_prop_sp_pv for its columns</w:t>
+            </w:r>
+          </w:p>
         </w:tc>
       </w:tr>
     </w:tbl>
@@ -29009,11 +29009,7 @@
           </w:tcPr>
           <w:p>
             <w:r>
-              <w:rPr>
-                <w:lang w:val="en-US"/>
-                <w:rtl w:val="off"/>
-              </w:rPr>
-              <w:t>Fail</w:t>
+              <w:t xml:space="preserve">Fail(Due to source issue)</w:t>
             </w:r>
           </w:p>
         </w:tc>
@@ -29057,7 +29053,11 @@
           <w:tcPr>
             <w:tcW w:w="5640" w:type="dxa"/>
           </w:tcPr>
-          <w:p/>
+          <w:p>
+            <w:r>
+              <w:t xml:space="preserve">Null at source table stg_maximus__pd_prop_sp_pv for its columns</w:t>
+            </w:r>
+          </w:p>
         </w:tc>
       </w:tr>
     </w:tbl>
@@ -29407,11 +29407,7 @@
           </w:tcPr>
           <w:p>
             <w:r>
-              <w:rPr>
-                <w:lang w:val="en-US"/>
-                <w:rtl w:val="off"/>
-              </w:rPr>
-              <w:t>Fail</w:t>
+              <w:t xml:space="preserve">Fail(Due to source issue)</w:t>
             </w:r>
           </w:p>
         </w:tc>
@@ -29455,7 +29451,11 @@
           <w:tcPr>
             <w:tcW w:w="5640" w:type="dxa"/>
           </w:tcPr>
-          <w:p/>
+          <w:p>
+            <w:r>
+              <w:t xml:space="preserve">Null at source table stg_maximus__pd_prop_sp_pv for its columns</w:t>
+            </w:r>
+          </w:p>
         </w:tc>
       </w:tr>
     </w:tbl>
@@ -29805,11 +29805,7 @@
           </w:tcPr>
           <w:p>
             <w:r>
-              <w:rPr>
-                <w:lang w:val="en-US"/>
-                <w:rtl w:val="off"/>
-              </w:rPr>
-              <w:t>Fail</w:t>
+              <w:t xml:space="preserve">Fail(Due to source issue)</w:t>
             </w:r>
           </w:p>
         </w:tc>
@@ -29853,7 +29849,11 @@
           <w:tcPr>
             <w:tcW w:w="5640" w:type="dxa"/>
           </w:tcPr>
-          <w:p/>
+          <w:p>
+            <w:r>
+              <w:t xml:space="preserve">Null at source table stg_maximus__pd_prop_sp_pv for its columns</w:t>
+            </w:r>
+          </w:p>
         </w:tc>
       </w:tr>
     </w:tbl>
@@ -30979,11 +30979,7 @@
           </w:tcPr>
           <w:p>
             <w:r>
-              <w:rPr>
-                <w:lang w:val="en-US"/>
-                <w:rtl w:val="off"/>
-              </w:rPr>
-              <w:t>Fail</w:t>
+              <w:t xml:space="preserve">Fail(Due to source issue)</w:t>
             </w:r>
           </w:p>
         </w:tc>
@@ -31027,7 +31023,11 @@
           <w:tcPr>
             <w:tcW w:w="5640" w:type="dxa"/>
           </w:tcPr>
-          <w:p/>
+          <w:p>
+            <w:r>
+              <w:t xml:space="preserve">Null at source table stg_maximus__pd_prop_sp_pv for its columns</w:t>
+            </w:r>
+          </w:p>
         </w:tc>
       </w:tr>
     </w:tbl>
@@ -31755,11 +31755,7 @@
           </w:tcPr>
           <w:p>
             <w:r>
-              <w:rPr>
-                <w:lang w:val="en-US"/>
-                <w:rtl w:val="off"/>
-              </w:rPr>
-              <w:t>Fail</w:t>
+              <w:t xml:space="preserve">Fail(Due to source issue)</w:t>
             </w:r>
           </w:p>
         </w:tc>
@@ -31803,7 +31799,11 @@
           <w:tcPr>
             <w:tcW w:w="5640" w:type="dxa"/>
           </w:tcPr>
-          <w:p/>
+          <w:p>
+            <w:r>
+              <w:t xml:space="preserve">Null at source table stg_maximus__pd_prop_sp_pv for its columns</w:t>
+            </w:r>
+          </w:p>
         </w:tc>
       </w:tr>
     </w:tbl>
@@ -33665,11 +33665,7 @@
           </w:tcPr>
           <w:p>
             <w:r>
-              <w:rPr>
-                <w:lang w:val="en-US"/>
-                <w:rtl w:val="off"/>
-              </w:rPr>
-              <w:t>Fail</w:t>
+              <w:t xml:space="preserve">Fail(Due to source issue)</w:t>
             </w:r>
           </w:p>
         </w:tc>
@@ -33713,7 +33709,11 @@
           <w:tcPr>
             <w:tcW w:w="5640" w:type="dxa"/>
           </w:tcPr>
-          <w:p/>
+          <w:p>
+            <w:r>
+              <w:t xml:space="preserve">Null at source table stg_maximus__pd_prop_sp_pv for its columns</w:t>
+            </w:r>
+          </w:p>
         </w:tc>
       </w:tr>
     </w:tbl>
@@ -34063,11 +34063,7 @@
           </w:tcPr>
           <w:p>
             <w:r>
-              <w:rPr>
-                <w:lang w:val="en-US"/>
-                <w:rtl w:val="off"/>
-              </w:rPr>
-              <w:t>Fail</w:t>
+              <w:t xml:space="preserve">Fail(Due to source issue)</w:t>
             </w:r>
           </w:p>
         </w:tc>
@@ -34111,7 +34107,11 @@
           <w:tcPr>
             <w:tcW w:w="5640" w:type="dxa"/>
           </w:tcPr>
-          <w:p/>
+          <w:p>
+            <w:r>
+              <w:t xml:space="preserve">Null at source table stg_maximus__pd_prop_sp_pv for its columns</w:t>
+            </w:r>
+          </w:p>
         </w:tc>
       </w:tr>
     </w:tbl>
@@ -34461,11 +34461,7 @@
           </w:tcPr>
           <w:p>
             <w:r>
-              <w:rPr>
-                <w:lang w:val="en-US"/>
-                <w:rtl w:val="off"/>
-              </w:rPr>
-              <w:t>Fail</w:t>
+              <w:t xml:space="preserve">Fail(Due to source issue)</w:t>
             </w:r>
           </w:p>
         </w:tc>
@@ -34509,7 +34505,11 @@
           <w:tcPr>
             <w:tcW w:w="5640" w:type="dxa"/>
           </w:tcPr>
-          <w:p/>
+          <w:p>
+            <w:r>
+              <w:t xml:space="preserve">Null at source table stg_maximus__pd_prop_sp_pv for its columns</w:t>
+            </w:r>
+          </w:p>
         </w:tc>
       </w:tr>
     </w:tbl>
@@ -42817,11 +42817,7 @@
           </w:tcPr>
           <w:p>
             <w:r>
-              <w:rPr>
-                <w:lang w:val="en-US"/>
-                <w:rtl w:val="off"/>
-              </w:rPr>
-              <w:t>Fail</w:t>
+              <w:t xml:space="preserve">Fail(Due to source issue)</w:t>
             </w:r>
           </w:p>
         </w:tc>
@@ -42865,7 +42861,11 @@
           <w:tcPr>
             <w:tcW w:w="5640" w:type="dxa"/>
           </w:tcPr>
-          <w:p/>
+          <w:p>
+            <w:r>
+              <w:t xml:space="preserve">Null at source table stg_maximus__pd_prop_sp_pv for its columns</w:t>
+            </w:r>
+          </w:p>
         </w:tc>
       </w:tr>
     </w:tbl>
@@ -43215,11 +43215,7 @@
           </w:tcPr>
           <w:p>
             <w:r>
-              <w:rPr>
-                <w:lang w:val="en-US"/>
-                <w:rtl w:val="off"/>
-              </w:rPr>
-              <w:t>Fail</w:t>
+              <w:t xml:space="preserve">Fail(Due to source issue)</w:t>
             </w:r>
           </w:p>
         </w:tc>
@@ -43263,7 +43259,11 @@
           <w:tcPr>
             <w:tcW w:w="5640" w:type="dxa"/>
           </w:tcPr>
-          <w:p/>
+          <w:p>
+            <w:r>
+              <w:t xml:space="preserve">Null at source table stg_maximus__pd_prop_sp_pv for its columns</w:t>
+            </w:r>
+          </w:p>
         </w:tc>
       </w:tr>
     </w:tbl>
@@ -45779,11 +45779,7 @@
           </w:tcPr>
           <w:p>
             <w:r>
-              <w:rPr>
-                <w:lang w:val="en-US"/>
-                <w:rtl w:val="off"/>
-              </w:rPr>
-              <w:t>Fail</w:t>
+              <w:t xml:space="preserve">Fail(Due to source issue)</w:t>
             </w:r>
           </w:p>
         </w:tc>
@@ -45827,7 +45823,11 @@
           <w:tcPr>
             <w:tcW w:w="5640" w:type="dxa"/>
           </w:tcPr>
-          <w:p/>
+          <w:p>
+            <w:r>
+              <w:t xml:space="preserve">Null at source tables stg_maximus__pd_prop_msdp_pv and stg_maximus__pd_prop_sp_pv for its columns</w:t>
+            </w:r>
+          </w:p>
         </w:tc>
       </w:tr>
     </w:tbl>
@@ -46575,11 +46575,7 @@
           </w:tcPr>
           <w:p>
             <w:r>
-              <w:rPr>
-                <w:lang w:val="en-US"/>
-                <w:rtl w:val="off"/>
-              </w:rPr>
-              <w:t>Fail</w:t>
+              <w:t xml:space="preserve">Fail(Due to source issue)</w:t>
             </w:r>
           </w:p>
         </w:tc>
@@ -46623,7 +46619,11 @@
           <w:tcPr>
             <w:tcW w:w="5640" w:type="dxa"/>
           </w:tcPr>
-          <w:p/>
+          <w:p>
+            <w:r>
+              <w:t xml:space="preserve">Null at source table stg_maximus__pd_prop_sp_pv for its columns</w:t>
+            </w:r>
+          </w:p>
         </w:tc>
       </w:tr>
     </w:tbl>
@@ -46973,11 +46973,7 @@
           </w:tcPr>
           <w:p>
             <w:r>
-              <w:rPr>
-                <w:lang w:val="en-US"/>
-                <w:rtl w:val="off"/>
-              </w:rPr>
-              <w:t>Fail</w:t>
+              <w:t xml:space="preserve">Fail(Due to source issue)</w:t>
             </w:r>
           </w:p>
         </w:tc>
@@ -47021,7 +47017,11 @@
           <w:tcPr>
             <w:tcW w:w="5640" w:type="dxa"/>
           </w:tcPr>
-          <w:p/>
+          <w:p>
+            <w:r>
+              <w:t xml:space="preserve">Null at source table stg_maximus__pd_prop_sp_pv for its columns</w:t>
+            </w:r>
+          </w:p>
         </w:tc>
       </w:tr>
     </w:tbl>
@@ -49891,11 +49891,7 @@
           </w:tcPr>
           <w:p>
             <w:r>
-              <w:rPr>
-                <w:lang w:val="en-US"/>
-                <w:rtl w:val="off"/>
-              </w:rPr>
-              <w:t>Fail</w:t>
+              <w:t xml:space="preserve">Fail(Due to source issue)</w:t>
             </w:r>
           </w:p>
         </w:tc>
@@ -49939,7 +49935,11 @@
           <w:tcPr>
             <w:tcW w:w="5640" w:type="dxa"/>
           </w:tcPr>
-          <w:p/>
+          <w:p>
+            <w:r>
+              <w:t xml:space="preserve">Null at source table stg_maximus__pd_prop_sp_pv for its columns</w:t>
+            </w:r>
+          </w:p>
         </w:tc>
       </w:tr>
     </w:tbl>
@@ -50289,11 +50289,7 @@
           </w:tcPr>
           <w:p>
             <w:r>
-              <w:rPr>
-                <w:lang w:val="en-US"/>
-                <w:rtl w:val="off"/>
-              </w:rPr>
-              <w:t>Fail</w:t>
+              <w:t xml:space="preserve">Fail(Due to source issue)</w:t>
             </w:r>
           </w:p>
         </w:tc>
@@ -50337,7 +50333,11 @@
           <w:tcPr>
             <w:tcW w:w="5640" w:type="dxa"/>
           </w:tcPr>
-          <w:p/>
+          <w:p>
+            <w:r>
+              <w:t xml:space="preserve">Null at source table stg_maximus__pd_prop_sp_pv for its columns</w:t>
+            </w:r>
+          </w:p>
         </w:tc>
       </w:tr>
     </w:tbl>
@@ -51129,11 +51129,7 @@
           </w:tcPr>
           <w:p>
             <w:r>
-              <w:rPr>
-                <w:lang w:val="en-US"/>
-                <w:rtl w:val="off"/>
-              </w:rPr>
-              <w:t>Fail</w:t>
+              <w:t xml:space="preserve">Fail(Due to source issue)</w:t>
             </w:r>
           </w:p>
         </w:tc>
@@ -51177,7 +51173,11 @@
           <w:tcPr>
             <w:tcW w:w="5640" w:type="dxa"/>
           </w:tcPr>
-          <w:p/>
+          <w:p>
+            <w:r>
+              <w:t xml:space="preserve">Null at source table stg_maximus__pd_prop_sp_pv for its columns</w:t>
+            </w:r>
+          </w:p>
         </w:tc>
       </w:tr>
     </w:tbl>
@@ -51969,11 +51969,7 @@
           </w:tcPr>
           <w:p>
             <w:r>
-              <w:rPr>
-                <w:lang w:val="en-US"/>
-                <w:rtl w:val="off"/>
-              </w:rPr>
-              <w:t>Fail</w:t>
+              <w:t xml:space="preserve">Fail(Due to source issue)</w:t>
             </w:r>
           </w:p>
         </w:tc>
@@ -52017,7 +52013,11 @@
           <w:tcPr>
             <w:tcW w:w="5640" w:type="dxa"/>
           </w:tcPr>
-          <w:p/>
+          <w:p>
+            <w:r>
+              <w:t xml:space="preserve">Null at source table stg_maximus__pd_prop_sp_pv for its columns</w:t>
+            </w:r>
+          </w:p>
         </w:tc>
       </w:tr>
     </w:tbl>
@@ -52367,11 +52367,7 @@
           </w:tcPr>
           <w:p>
             <w:r>
-              <w:rPr>
-                <w:lang w:val="en-US"/>
-                <w:rtl w:val="off"/>
-              </w:rPr>
-              <w:t>Fail</w:t>
+              <w:t xml:space="preserve">Fail(Due to source issue)</w:t>
             </w:r>
           </w:p>
         </w:tc>
@@ -52415,7 +52411,11 @@
           <w:tcPr>
             <w:tcW w:w="5640" w:type="dxa"/>
           </w:tcPr>
-          <w:p/>
+          <w:p>
+            <w:r>
+              <w:t xml:space="preserve">Null at source table stg_maximus__pd_prop_sp_pv for its columns</w:t>
+            </w:r>
+          </w:p>
         </w:tc>
       </w:tr>
     </w:tbl>
@@ -53605,11 +53605,7 @@
           </w:tcPr>
           <w:p>
             <w:r>
-              <w:rPr>
-                <w:lang w:val="en-US"/>
-                <w:rtl w:val="off"/>
-              </w:rPr>
-              <w:t>Fail</w:t>
+              <w:t xml:space="preserve">Fail(Due to source issue)</w:t>
             </w:r>
           </w:p>
         </w:tc>
@@ -53653,7 +53649,11 @@
           <w:tcPr>
             <w:tcW w:w="5640" w:type="dxa"/>
           </w:tcPr>
-          <w:p/>
+          <w:p>
+            <w:r>
+              <w:t xml:space="preserve">Null at source table stg_maximus__pd_prop_sp_pv for its columns</w:t>
+            </w:r>
+          </w:p>
         </w:tc>
       </w:tr>
     </w:tbl>

</xml_diff>

<commit_message>
DM-T2 MAXIMUS docx: fill Result + Remarks for shared-table fails
22 shared OPUS/MAXIMUS sections: #12 LNK_PARTY_LOCATION set to Pass (incremental
run completed); the other 21 set Fail(Due to source issue) with the null source
table. #76 and #98 carry the specific missing-column detail.
</commit_message>
<xml_diff>
--- a/BGIL_DBT/validation/DM-T/DM-T2_MAXIMUS.docx
+++ b/BGIL_DBT/validation/DM-T/DM-T2_MAXIMUS.docx
@@ -12735,11 +12735,7 @@
           </w:tcPr>
           <w:p>
             <w:r>
-              <w:rPr>
-                <w:lang w:val="en-US"/>
-                <w:rtl w:val="off"/>
-              </w:rPr>
-              <w:t>Pass</w:t>
+              <w:t xml:space="preserve">Pass</w:t>
             </w:r>
           </w:p>
         </w:tc>
@@ -12783,7 +12779,11 @@
           <w:tcPr>
             <w:tcW w:w="5640" w:type="dxa"/>
           </w:tcPr>
-          <w:p/>
+          <w:p>
+            <w:r>
+              <w:t xml:space="preserve">Incremental run completed; rows now load.</w:t>
+            </w:r>
+          </w:p>
         </w:tc>
       </w:tr>
     </w:tbl>
@@ -17757,11 +17757,7 @@
           </w:tcPr>
           <w:p>
             <w:r>
-              <w:rPr>
-                <w:lang w:val="en-US"/>
-                <w:rtl w:val="off"/>
-              </w:rPr>
-              <w:t>Fail</w:t>
+              <w:t xml:space="preserve">Fail(Due to source issue)</w:t>
             </w:r>
           </w:p>
         </w:tc>
@@ -17805,7 +17801,11 @@
           <w:tcPr>
             <w:tcW w:w="5640" w:type="dxa"/>
           </w:tcPr>
-          <w:p/>
+          <w:p>
+            <w:r>
+              <w:t xml:space="preserve">Null at source table stg_maximus__pd_prop_sp_pv for its columns</w:t>
+            </w:r>
+          </w:p>
         </w:tc>
       </w:tr>
     </w:tbl>
@@ -18155,11 +18155,7 @@
           </w:tcPr>
           <w:p>
             <w:r>
-              <w:rPr>
-                <w:lang w:val="en-US"/>
-                <w:rtl w:val="off"/>
-              </w:rPr>
-              <w:t>Fail</w:t>
+              <w:t xml:space="preserve">Fail(Due to source issue)</w:t>
             </w:r>
           </w:p>
         </w:tc>
@@ -18203,7 +18199,11 @@
           <w:tcPr>
             <w:tcW w:w="5640" w:type="dxa"/>
           </w:tcPr>
-          <w:p/>
+          <w:p>
+            <w:r>
+              <w:t xml:space="preserve">Null at source table stg_maximus__pd_prop_sp_pv for its columns</w:t>
+            </w:r>
+          </w:p>
         </w:tc>
       </w:tr>
     </w:tbl>
@@ -18995,11 +18995,7 @@
           </w:tcPr>
           <w:p>
             <w:r>
-              <w:rPr>
-                <w:lang w:val="en-US"/>
-                <w:rtl w:val="off"/>
-              </w:rPr>
-              <w:t>Fail</w:t>
+              <w:t xml:space="preserve">Fail(Due to source issue)</w:t>
             </w:r>
           </w:p>
         </w:tc>
@@ -19043,7 +19039,11 @@
           <w:tcPr>
             <w:tcW w:w="5640" w:type="dxa"/>
           </w:tcPr>
-          <w:p/>
+          <w:p>
+            <w:r>
+              <w:t xml:space="preserve">Null at source table stg_maximus__pd_prop_sp_pv for its columns</w:t>
+            </w:r>
+          </w:p>
         </w:tc>
       </w:tr>
     </w:tbl>
@@ -19437,11 +19437,7 @@
           </w:tcPr>
           <w:p>
             <w:r>
-              <w:rPr>
-                <w:lang w:val="en-US"/>
-                <w:rtl w:val="off"/>
-              </w:rPr>
-              <w:t>Fail</w:t>
+              <w:t xml:space="preserve">Fail(Due to source issue)</w:t>
             </w:r>
           </w:p>
         </w:tc>
@@ -19485,7 +19481,11 @@
           <w:tcPr>
             <w:tcW w:w="5640" w:type="dxa"/>
           </w:tcPr>
-          <w:p/>
+          <w:p>
+            <w:r>
+              <w:t xml:space="preserve">Null at source table stg_maximus__pd_prop_sp_pv for its columns</w:t>
+            </w:r>
+          </w:p>
         </w:tc>
       </w:tr>
     </w:tbl>
@@ -35743,11 +35743,7 @@
           </w:tcPr>
           <w:p>
             <w:r>
-              <w:rPr>
-                <w:lang w:val="en-US"/>
-                <w:rtl w:val="off"/>
-              </w:rPr>
-              <w:t>Fail</w:t>
+              <w:t xml:space="preserve">Fail(Due to source issue)</w:t>
             </w:r>
           </w:p>
         </w:tc>
@@ -35791,7 +35787,11 @@
           <w:tcPr>
             <w:tcW w:w="5640" w:type="dxa"/>
           </w:tcPr>
-          <w:p/>
+          <w:p>
+            <w:r>
+              <w:t xml:space="preserve">Null at source table stg_maximus__pd_prop_sp_pv for its columns</w:t>
+            </w:r>
+          </w:p>
         </w:tc>
       </w:tr>
     </w:tbl>
@@ -36141,11 +36141,7 @@
           </w:tcPr>
           <w:p>
             <w:r>
-              <w:rPr>
-                <w:lang w:val="en-US"/>
-                <w:rtl w:val="off"/>
-              </w:rPr>
-              <w:t>Fail</w:t>
+              <w:t xml:space="preserve">Fail(Due to source issue)</w:t>
             </w:r>
           </w:p>
         </w:tc>
@@ -36189,7 +36185,11 @@
           <w:tcPr>
             <w:tcW w:w="5640" w:type="dxa"/>
           </w:tcPr>
-          <w:p/>
+          <w:p>
+            <w:r>
+              <w:t xml:space="preserve">Null at source table stg_maximus__pd_prop_sp_pv for its columns</w:t>
+            </w:r>
+          </w:p>
         </w:tc>
       </w:tr>
     </w:tbl>
@@ -36539,11 +36539,7 @@
           </w:tcPr>
           <w:p>
             <w:r>
-              <w:rPr>
-                <w:lang w:val="en-US"/>
-                <w:rtl w:val="off"/>
-              </w:rPr>
-              <w:t>Fail</w:t>
+              <w:t xml:space="preserve">Fail(Due to source issue)</w:t>
             </w:r>
           </w:p>
         </w:tc>
@@ -36587,7 +36583,11 @@
           <w:tcPr>
             <w:tcW w:w="5640" w:type="dxa"/>
           </w:tcPr>
-          <w:p/>
+          <w:p>
+            <w:r>
+              <w:t xml:space="preserve">Null at source table stg_maximus__pd_prop_sp_pv for its columns</w:t>
+            </w:r>
+          </w:p>
         </w:tc>
       </w:tr>
     </w:tbl>
@@ -36937,11 +36937,7 @@
           </w:tcPr>
           <w:p>
             <w:r>
-              <w:rPr>
-                <w:lang w:val="en-US"/>
-                <w:rtl w:val="off"/>
-              </w:rPr>
-              <w:t>Fail</w:t>
+              <w:t xml:space="preserve">Fail(Due to source issue)</w:t>
             </w:r>
           </w:p>
         </w:tc>
@@ -36985,7 +36981,11 @@
           <w:tcPr>
             <w:tcW w:w="5640" w:type="dxa"/>
           </w:tcPr>
-          <w:p/>
+          <w:p>
+            <w:r>
+              <w:t xml:space="preserve">Null at source table stg_maximus__pd_prop_sp_pv for its columns</w:t>
+            </w:r>
+          </w:p>
         </w:tc>
       </w:tr>
     </w:tbl>
@@ -39103,11 +39103,7 @@
           </w:tcPr>
           <w:p>
             <w:r>
-              <w:rPr>
-                <w:lang w:val="en-US"/>
-                <w:rtl w:val="off"/>
-              </w:rPr>
-              <w:t>Fail</w:t>
+              <w:t xml:space="preserve">Fail(Due to source issue)</w:t>
             </w:r>
           </w:p>
         </w:tc>
@@ -39151,7 +39147,11 @@
           <w:tcPr>
             <w:tcW w:w="5640" w:type="dxa"/>
           </w:tcPr>
-          <w:p/>
+          <w:p>
+            <w:r>
+              <w:t xml:space="preserve">Column missing from source stg_maximus__pd_prop_msdp_pv; stg_maximus__pd_prop_sp_pv missing columns (date_of_joiningdfadvocate, date_of_joininghcadvocate, date_of_joiningstadvocate, cancel_on).</w:t>
+            </w:r>
+          </w:p>
         </w:tc>
       </w:tr>
     </w:tbl>
@@ -39501,11 +39501,7 @@
           </w:tcPr>
           <w:p>
             <w:r>
-              <w:rPr>
-                <w:lang w:val="en-US"/>
-                <w:rtl w:val="off"/>
-              </w:rPr>
-              <w:t>Fail</w:t>
+              <w:t xml:space="preserve">Fail(Due to source issue)</w:t>
             </w:r>
           </w:p>
         </w:tc>
@@ -39549,7 +39545,11 @@
           <w:tcPr>
             <w:tcW w:w="5640" w:type="dxa"/>
           </w:tcPr>
-          <w:p/>
+          <w:p>
+            <w:r>
+              <w:t xml:space="preserve">Null at source table stg_maximus__pd_prop_sp_pv for its columns</w:t>
+            </w:r>
+          </w:p>
         </w:tc>
       </w:tr>
     </w:tbl>
@@ -39899,11 +39899,7 @@
           </w:tcPr>
           <w:p>
             <w:r>
-              <w:rPr>
-                <w:lang w:val="en-US"/>
-                <w:rtl w:val="off"/>
-              </w:rPr>
-              <w:t>Fail</w:t>
+              <w:t xml:space="preserve">Fail(Due to source issue)</w:t>
             </w:r>
           </w:p>
         </w:tc>
@@ -39947,7 +39943,11 @@
           <w:tcPr>
             <w:tcW w:w="5640" w:type="dxa"/>
           </w:tcPr>
-          <w:p/>
+          <w:p>
+            <w:r>
+              <w:t xml:space="preserve">Null at source table stg_maximus__pd_prop_sp_pv for its columns</w:t>
+            </w:r>
+          </w:p>
         </w:tc>
       </w:tr>
     </w:tbl>
@@ -41181,11 +41181,7 @@
           </w:tcPr>
           <w:p>
             <w:r>
-              <w:rPr>
-                <w:lang w:val="en-US"/>
-                <w:rtl w:val="off"/>
-              </w:rPr>
-              <w:t>Fail</w:t>
+              <w:t xml:space="preserve">Fail(Due to source issue)</w:t>
             </w:r>
           </w:p>
         </w:tc>
@@ -41229,7 +41225,11 @@
           <w:tcPr>
             <w:tcW w:w="5640" w:type="dxa"/>
           </w:tcPr>
-          <w:p/>
+          <w:p>
+            <w:r>
+              <w:t xml:space="preserve">Null at source table stg_maximus__pd_prop_sp_pv for its columns</w:t>
+            </w:r>
+          </w:p>
         </w:tc>
       </w:tr>
     </w:tbl>
@@ -41579,11 +41579,7 @@
           </w:tcPr>
           <w:p>
             <w:r>
-              <w:rPr>
-                <w:lang w:val="en-US"/>
-                <w:rtl w:val="off"/>
-              </w:rPr>
-              <w:t>Fail</w:t>
+              <w:t xml:space="preserve">Fail(Due to source issue)</w:t>
             </w:r>
           </w:p>
         </w:tc>
@@ -41627,7 +41623,11 @@
           <w:tcPr>
             <w:tcW w:w="5640" w:type="dxa"/>
           </w:tcPr>
-          <w:p/>
+          <w:p>
+            <w:r>
+              <w:t xml:space="preserve">Null at source table stg_maximus__pd_prop_sp_pv for its columns</w:t>
+            </w:r>
+          </w:p>
         </w:tc>
       </w:tr>
     </w:tbl>
@@ -41977,11 +41977,7 @@
           </w:tcPr>
           <w:p>
             <w:r>
-              <w:rPr>
-                <w:lang w:val="en-US"/>
-                <w:rtl w:val="off"/>
-              </w:rPr>
-              <w:t>Fail</w:t>
+              <w:t xml:space="preserve">Fail(Due to source issue)</w:t>
             </w:r>
           </w:p>
         </w:tc>
@@ -42025,7 +42021,11 @@
           <w:tcPr>
             <w:tcW w:w="5640" w:type="dxa"/>
           </w:tcPr>
-          <w:p/>
+          <w:p>
+            <w:r>
+              <w:t xml:space="preserve">Null at source table stg_maximus__pd_prop_sp_pv for its columns</w:t>
+            </w:r>
+          </w:p>
         </w:tc>
       </w:tr>
     </w:tbl>
@@ -44055,11 +44055,7 @@
           </w:tcPr>
           <w:p>
             <w:r>
-              <w:rPr>
-                <w:lang w:val="en-US"/>
-                <w:rtl w:val="off"/>
-              </w:rPr>
-              <w:t>Fail</w:t>
+              <w:t xml:space="preserve">Fail(Due to source issue)</w:t>
             </w:r>
           </w:p>
         </w:tc>
@@ -44103,7 +44099,11 @@
           <w:tcPr>
             <w:tcW w:w="5640" w:type="dxa"/>
           </w:tcPr>
-          <w:p/>
+          <w:p>
+            <w:r>
+              <w:t xml:space="preserve">Null at source table stg_maximus__pd_prop_sp_pv for its columns</w:t>
+            </w:r>
+          </w:p>
         </w:tc>
       </w:tr>
     </w:tbl>
@@ -46177,11 +46177,7 @@
           </w:tcPr>
           <w:p>
             <w:r>
-              <w:rPr>
-                <w:lang w:val="en-US"/>
-                <w:rtl w:val="off"/>
-              </w:rPr>
-              <w:t>Fail</w:t>
+              <w:t xml:space="preserve">Fail(Due to source issue)</w:t>
             </w:r>
           </w:p>
         </w:tc>
@@ -46225,7 +46221,11 @@
           <w:tcPr>
             <w:tcW w:w="5640" w:type="dxa"/>
           </w:tcPr>
-          <w:p/>
+          <w:p>
+            <w:r>
+              <w:t xml:space="preserve">Null at source table stg_maximus__pd_prop_sp_pv for its columns</w:t>
+            </w:r>
+          </w:p>
         </w:tc>
       </w:tr>
     </w:tbl>
@@ -47371,11 +47371,7 @@
           </w:tcPr>
           <w:p>
             <w:r>
-              <w:rPr>
-                <w:lang w:val="en-US"/>
-                <w:rtl w:val="off"/>
-              </w:rPr>
-              <w:t>Fail</w:t>
+              <w:t xml:space="preserve">Fail(Due to source issue)</w:t>
             </w:r>
           </w:p>
         </w:tc>
@@ -47419,7 +47415,11 @@
           <w:tcPr>
             <w:tcW w:w="5640" w:type="dxa"/>
           </w:tcPr>
-          <w:p/>
+          <w:p>
+            <w:r>
+              <w:t xml:space="preserve">Null at source table stg_maximus__pd_prop_sp_pv for its columns</w:t>
+            </w:r>
+          </w:p>
         </w:tc>
       </w:tr>
     </w:tbl>
@@ -48211,11 +48211,7 @@
           </w:tcPr>
           <w:p>
             <w:r>
-              <w:rPr>
-                <w:lang w:val="en-US"/>
-                <w:rtl w:val="off"/>
-              </w:rPr>
-              <w:t>Fail</w:t>
+              <w:t xml:space="preserve">Fail(Due to source issue)</w:t>
             </w:r>
           </w:p>
         </w:tc>
@@ -48259,7 +48255,11 @@
           <w:tcPr>
             <w:tcW w:w="5640" w:type="dxa"/>
           </w:tcPr>
-          <w:p/>
+          <w:p>
+            <w:r>
+              <w:t xml:space="preserve">Column missing from source stg_maximus__pd_prop_sp_pv and stg_maximus__pd_prop_msdp_pv.</w:t>
+            </w:r>
+          </w:p>
         </w:tc>
       </w:tr>
     </w:tbl>
@@ -49493,11 +49493,7 @@
           </w:tcPr>
           <w:p>
             <w:r>
-              <w:rPr>
-                <w:lang w:val="en-US"/>
-                <w:rtl w:val="off"/>
-              </w:rPr>
-              <w:t>Fail</w:t>
+              <w:t xml:space="preserve">Fail(Due to source issue)</w:t>
             </w:r>
           </w:p>
         </w:tc>
@@ -49541,7 +49537,11 @@
           <w:tcPr>
             <w:tcW w:w="5640" w:type="dxa"/>
           </w:tcPr>
-          <w:p/>
+          <w:p>
+            <w:r>
+              <w:t xml:space="preserve">Null at source table stg_maximus__pd_prop_sp_pv for its columns</w:t>
+            </w:r>
+          </w:p>
         </w:tc>
       </w:tr>
     </w:tbl>
@@ -53207,11 +53207,7 @@
           </w:tcPr>
           <w:p>
             <w:r>
-              <w:rPr>
-                <w:lang w:val="en-US"/>
-                <w:rtl w:val="off"/>
-              </w:rPr>
-              <w:t>Fail</w:t>
+              <w:t xml:space="preserve">Fail(Due to source issue)</w:t>
             </w:r>
           </w:p>
         </w:tc>
@@ -53255,7 +53251,11 @@
           <w:tcPr>
             <w:tcW w:w="5640" w:type="dxa"/>
           </w:tcPr>
-          <w:p/>
+          <w:p>
+            <w:r>
+              <w:t xml:space="preserve">Null at source table stg_maximus__pd_prop_sp_pv for its columns</w:t>
+            </w:r>
+          </w:p>
         </w:tc>
       </w:tr>
     </w:tbl>
@@ -54003,11 +54003,7 @@
           </w:tcPr>
           <w:p>
             <w:r>
-              <w:rPr>
-                <w:lang w:val="en-US"/>
-                <w:rtl w:val="off"/>
-              </w:rPr>
-              <w:t>Fail</w:t>
+              <w:t xml:space="preserve">Fail(Due to source issue)</w:t>
             </w:r>
           </w:p>
         </w:tc>
@@ -54051,7 +54047,11 @@
           <w:tcPr>
             <w:tcW w:w="5640" w:type="dxa"/>
           </w:tcPr>
-          <w:p/>
+          <w:p>
+            <w:r>
+              <w:t xml:space="preserve">Null at source table stg_maximus__pd_prop_sp_pv for its columns</w:t>
+            </w:r>
+          </w:p>
         </w:tc>
       </w:tr>
     </w:tbl>

</xml_diff>